<commit_message>
Replace complex numbering in refs with placeholder
</commit_message>
<xml_diff>
--- a/tests/_fixtures/a_book/01_a.docx
+++ b/tests/_fixtures/a_book/01_a.docx
@@ -392,53 +392,140 @@
     <w:p>
       <w:pPr>
         <w:pStyle w:val="Caption"/>
-      </w:pPr>
-      <w:r>
+        <w:rPr>
+          <w:i w:val="0"/>
+          <w:iCs/>
+        </w:rPr>
+      </w:pPr>
+      <w:bookmarkStart w:id="5" w:name="equationWithComplexNumbering"/>
+      <w:r>
+        <w:rPr>
+          <w:b/>
+          <w:bCs/>
+          <w:i w:val="0"/>
+          <w:iCs/>
+        </w:rPr>
         <w:t xml:space="preserve">Equation </w:t>
       </w:r>
       <w:r>
+        <w:rPr>
+          <w:b/>
+          <w:bCs/>
+          <w:i w:val="0"/>
+          <w:iCs/>
+        </w:rPr>
         <w:fldChar w:fldCharType="begin"/>
       </w:r>
       <w:r>
+        <w:rPr>
+          <w:b/>
+          <w:bCs/>
+          <w:i w:val="0"/>
+          <w:iCs/>
+        </w:rPr>
         <w:instrText xml:space="preserve"> STYLEREF 1 \s </w:instrText>
       </w:r>
       <w:r>
+        <w:rPr>
+          <w:b/>
+          <w:bCs/>
+          <w:i w:val="0"/>
+          <w:iCs/>
+        </w:rPr>
         <w:fldChar w:fldCharType="separate"/>
       </w:r>
       <w:r>
         <w:rPr>
+          <w:b/>
+          <w:bCs/>
+          <w:i w:val="0"/>
+          <w:iCs/>
           <w:noProof/>
         </w:rPr>
         <w:t>I</w:t>
       </w:r>
       <w:r>
+        <w:rPr>
+          <w:b/>
+          <w:bCs/>
+          <w:i w:val="0"/>
+          <w:iCs/>
+        </w:rPr>
         <w:fldChar w:fldCharType="end"/>
       </w:r>
       <w:r>
+        <w:rPr>
+          <w:b/>
+          <w:bCs/>
+          <w:i w:val="0"/>
+          <w:iCs/>
+        </w:rPr>
         <w:t>.</w:t>
       </w:r>
       <w:r>
+        <w:rPr>
+          <w:b/>
+          <w:bCs/>
+          <w:i w:val="0"/>
+          <w:iCs/>
+        </w:rPr>
         <w:fldChar w:fldCharType="begin"/>
       </w:r>
       <w:r>
+        <w:rPr>
+          <w:b/>
+          <w:bCs/>
+          <w:i w:val="0"/>
+          <w:iCs/>
+        </w:rPr>
         <w:instrText xml:space="preserve"> SEQ Equation \* ALPHABETIC \s 1 </w:instrText>
       </w:r>
       <w:r>
+        <w:rPr>
+          <w:b/>
+          <w:bCs/>
+          <w:i w:val="0"/>
+          <w:iCs/>
+        </w:rPr>
         <w:fldChar w:fldCharType="separate"/>
       </w:r>
       <w:r>
         <w:rPr>
+          <w:b/>
+          <w:bCs/>
+          <w:i w:val="0"/>
+          <w:iCs/>
           <w:noProof/>
         </w:rPr>
         <w:t>A</w:t>
       </w:r>
       <w:r>
+        <w:rPr>
+          <w:b/>
+          <w:bCs/>
+          <w:i w:val="0"/>
+          <w:iCs/>
+        </w:rPr>
         <w:fldChar w:fldCharType="end"/>
       </w:r>
       <w:r>
-        <w:t>: Caption with chapter number and non-digit item number.</w:t>
-      </w:r>
-    </w:p>
+        <w:rPr>
+          <w:b/>
+          <w:bCs/>
+          <w:i w:val="0"/>
+          <w:iCs/>
+        </w:rPr>
+        <w:t>:</w:t>
+      </w:r>
+      <w:r>
+        <w:rPr>
+          <w:i w:val="0"/>
+          <w:iCs/>
+        </w:rPr>
+        <w:t xml:space="preserve"> Caption with chapter number and non-digit item number.</w:t>
+      </w:r>
+    </w:p>
+    <w:bookmarkEnd w:id="5"/>
     <w:p>
       <w:pPr>
         <w:pStyle w:val="BodyText"/>
@@ -1067,6 +1154,74 @@
         <w:pStyle w:val="BodyText"/>
         <w:jc w:val="both"/>
       </w:pPr>
+      <w:r>
+        <w:t xml:space="preserve">Links vs </w:t>
+      </w:r>
+      <w:r>
+        <w:t>numbering</w:t>
+      </w:r>
+      <w:r>
+        <w:t>:</w:t>
+      </w:r>
+      <w:r>
+        <w:t xml:space="preserve"> cross-reference to </w:t>
+      </w:r>
+      <w:r>
+        <w:fldChar w:fldCharType="begin"/>
+      </w:r>
+      <w:r>
+        <w:instrText xml:space="preserve"> REF _Ref177042490 \h  \* MERGEFORMAT </w:instrText>
+      </w:r>
+      <w:r>
+        <w:fldChar w:fldCharType="separate"/>
+      </w:r>
+      <w:r>
+        <w:rPr>
+          <w:iCs/>
+        </w:rPr>
+        <w:t xml:space="preserve">Figure </w:t>
+      </w:r>
+      <w:r>
+        <w:rPr>
+          <w:iCs/>
+          <w:noProof/>
+        </w:rPr>
+        <w:t>1</w:t>
+      </w:r>
+      <w:r>
+        <w:fldChar w:fldCharType="end"/>
+      </w:r>
+      <w:r>
+        <w:t xml:space="preserve">, </w:t>
+      </w:r>
+      <w:hyperlink w:anchor="equationWithComplexNumbering" w:history="1">
+        <w:r>
+          <w:rPr>
+            <w:rStyle w:val="Hyperlink"/>
+          </w:rPr>
+          <w:t>link to equation I.1 in the same document</w:t>
+        </w:r>
+      </w:hyperlink>
+      <w:r>
+        <w:t xml:space="preserve">, </w:t>
+      </w:r>
+      <w:hyperlink r:id="rId14" w:anchor="figForDigitalAndPaper" w:history="1">
+        <w:r>
+          <w:rPr>
+            <w:rStyle w:val="Hyperlink"/>
+          </w:rPr>
+          <w:t>link to figure 3 in a separate document</w:t>
+        </w:r>
+      </w:hyperlink>
+      <w:r>
+        <w:t>.</w:t>
+      </w:r>
+    </w:p>
+    <w:p>
+      <w:pPr>
+        <w:pStyle w:val="BodyText"/>
+        <w:jc w:val="both"/>
+      </w:pPr>
     </w:p>
     <w:p>
       <w:pPr>
@@ -1087,7 +1242,7 @@
       <w:r>
         <w:t xml:space="preserve">, </w:t>
       </w:r>
-      <w:hyperlink r:id="rId14" w:anchor="deletedTarget" w:history="1">
+      <w:hyperlink r:id="rId15" w:anchor="deletedTarget" w:history="1">
         <w:r>
           <w:rPr>
             <w:rStyle w:val="Hyperlink"/>
@@ -1098,7 +1253,7 @@
       <w:r>
         <w:t xml:space="preserve">, </w:t>
       </w:r>
-      <w:hyperlink r:id="rId15" w:anchor="h2Subheading" w:history="1">
+      <w:hyperlink r:id="rId16" w:anchor="h2Subheading" w:history="1">
         <w:r>
           <w:rPr>
             <w:rStyle w:val="Hyperlink"/>
@@ -1115,7 +1270,7 @@
         <w:pStyle w:val="BodyText"/>
         <w:jc w:val="both"/>
       </w:pPr>
-      <w:hyperlink r:id="rId16" w:anchor="h1HyperlinksB" w:history="1">
+      <w:hyperlink r:id="rId17" w:anchor="h1HyperlinksB" w:history="1">
         <w:r>
           <w:rPr>
             <w:rStyle w:val="Hyperlink"/>
@@ -1138,7 +1293,7 @@
         <w:pStyle w:val="BodyText"/>
         <w:jc w:val="both"/>
       </w:pPr>
-      <w:hyperlink r:id="rId17" w:history="1">
+      <w:hyperlink r:id="rId18" w:history="1">
         <w:r>
           <w:rPr>
             <w:rStyle w:val="Hyperlink"/>
@@ -1167,7 +1322,7 @@
         <w:pStyle w:val="BodyText"/>
         <w:jc w:val="both"/>
       </w:pPr>
-      <w:hyperlink r:id="rId18" w:history="1">
+      <w:hyperlink r:id="rId19" w:history="1">
         <w:r>
           <w:rPr>
             <w:rStyle w:val="Hyperlink"/>

</xml_diff>

<commit_message>
Add automatic numbering if author writes 'XXX' in a reference
</commit_message>
<xml_diff>
--- a/tests/_fixtures/a_book/01_a.docx
+++ b/tests/_fixtures/a_book/01_a.docx
@@ -1047,18 +1047,6 @@
           </w:rPr>
           <w:t>Heading</w:t>
         </w:r>
-        <w:r>
-          <w:rPr>
-            <w:rStyle w:val="Hyperlink"/>
-          </w:rPr>
-          <w:t xml:space="preserve"> </w:t>
-        </w:r>
-        <w:r>
-          <w:rPr>
-            <w:rStyle w:val="Hyperlink"/>
-          </w:rPr>
-          <w:t>1</w:t>
-        </w:r>
       </w:hyperlink>
       <w:r>
         <w:t xml:space="preserve">, </w:t>
@@ -1068,7 +1056,7 @@
           <w:rPr>
             <w:rStyle w:val="Hyperlink"/>
           </w:rPr>
-          <w:t>Figure</w:t>
+          <w:t>Figure XXX</w:t>
         </w:r>
       </w:hyperlink>
       <w:r>
@@ -1085,7 +1073,7 @@
           <w:rPr>
             <w:rStyle w:val="Hyperlink"/>
           </w:rPr>
-          <w:t>Table</w:t>
+          <w:t>Table XXX</w:t>
         </w:r>
       </w:hyperlink>
       <w:r>
@@ -1155,67 +1143,25 @@
         <w:jc w:val="both"/>
       </w:pPr>
       <w:r>
-        <w:t xml:space="preserve">Links vs </w:t>
-      </w:r>
-      <w:r>
-        <w:t>numbering</w:t>
-      </w:r>
-      <w:r>
-        <w:t>:</w:t>
-      </w:r>
-      <w:r>
-        <w:t xml:space="preserve"> cross-reference to </w:t>
-      </w:r>
-      <w:r>
-        <w:fldChar w:fldCharType="begin"/>
-      </w:r>
-      <w:r>
-        <w:instrText xml:space="preserve"> REF _Ref177042490 \h  \* MERGEFORMAT </w:instrText>
-      </w:r>
-      <w:r>
-        <w:fldChar w:fldCharType="separate"/>
-      </w:r>
-      <w:r>
-        <w:rPr>
-          <w:iCs/>
-        </w:rPr>
-        <w:t xml:space="preserve">Figure </w:t>
-      </w:r>
-      <w:r>
-        <w:rPr>
-          <w:iCs/>
-          <w:noProof/>
-        </w:rPr>
-        <w:t>1</w:t>
-      </w:r>
-      <w:r>
-        <w:fldChar w:fldCharType="end"/>
-      </w:r>
-      <w:r>
-        <w:t xml:space="preserve">, </w:t>
+        <w:t xml:space="preserve">Complex numbering: </w:t>
       </w:r>
       <w:hyperlink w:anchor="equationWithComplexNumbering" w:history="1">
         <w:r>
           <w:rPr>
             <w:rStyle w:val="Hyperlink"/>
           </w:rPr>
-          <w:t>link to equation I.1 in the same document</w:t>
+          <w:t>see equation I.1</w:t>
         </w:r>
       </w:hyperlink>
       <w:r>
-        <w:t xml:space="preserve">, </w:t>
-      </w:r>
-      <w:hyperlink r:id="rId14" w:anchor="figForDigitalAndPaper" w:history="1">
-        <w:r>
-          <w:rPr>
-            <w:rStyle w:val="Hyperlink"/>
-          </w:rPr>
-          <w:t>link to figure 3 in a separate document</w:t>
-        </w:r>
-      </w:hyperlink>
-      <w:r>
         <w:t>.</w:t>
       </w:r>
+    </w:p>
+    <w:p>
+      <w:pPr>
+        <w:pStyle w:val="BodyText"/>
+        <w:jc w:val="both"/>
+      </w:pPr>
     </w:p>
     <w:p>
       <w:pPr>
@@ -1242,7 +1188,7 @@
       <w:r>
         <w:t xml:space="preserve">, </w:t>
       </w:r>
-      <w:hyperlink r:id="rId15" w:anchor="deletedTarget" w:history="1">
+      <w:hyperlink r:id="rId14" w:anchor="deletedTarget" w:history="1">
         <w:r>
           <w:rPr>
             <w:rStyle w:val="Hyperlink"/>
@@ -1253,7 +1199,7 @@
       <w:r>
         <w:t xml:space="preserve">, </w:t>
       </w:r>
-      <w:hyperlink r:id="rId16" w:anchor="h2Subheading" w:history="1">
+      <w:hyperlink r:id="rId15" w:anchor="h2Subheading" w:history="1">
         <w:r>
           <w:rPr>
             <w:rStyle w:val="Hyperlink"/>
@@ -1270,7 +1216,7 @@
         <w:pStyle w:val="BodyText"/>
         <w:jc w:val="both"/>
       </w:pPr>
-      <w:hyperlink r:id="rId17" w:anchor="h1HyperlinksB" w:history="1">
+      <w:hyperlink r:id="rId16" w:anchor="h1HyperlinksB" w:history="1">
         <w:r>
           <w:rPr>
             <w:rStyle w:val="Hyperlink"/>
@@ -1293,7 +1239,7 @@
         <w:pStyle w:val="BodyText"/>
         <w:jc w:val="both"/>
       </w:pPr>
-      <w:hyperlink r:id="rId18" w:history="1">
+      <w:hyperlink r:id="rId17" w:history="1">
         <w:r>
           <w:rPr>
             <w:rStyle w:val="Hyperlink"/>
@@ -1322,7 +1268,7 @@
         <w:pStyle w:val="BodyText"/>
         <w:jc w:val="both"/>
       </w:pPr>
-      <w:hyperlink r:id="rId19" w:history="1">
+      <w:hyperlink r:id="rId18" w:history="1">
         <w:r>
           <w:rPr>
             <w:rStyle w:val="Hyperlink"/>

</xml_diff>

<commit_message>
Add test of referencing conditionally rendered targets
</commit_message>
<xml_diff>
--- a/tests/_fixtures/a_book/01_a.docx
+++ b/tests/_fixtures/a_book/01_a.docx
@@ -1162,6 +1162,42 @@
         <w:pStyle w:val="BodyText"/>
         <w:jc w:val="both"/>
       </w:pPr>
+      <w:r>
+        <w:t xml:space="preserve">Conditional rendering: </w:t>
+      </w:r>
+      <w:hyperlink r:id="rId14" w:anchor="figForDigital" w:history="1">
+        <w:r>
+          <w:rPr>
+            <w:rStyle w:val="Hyperlink"/>
+          </w:rPr>
+          <w:t>link to fig XXX (digital only)</w:t>
+        </w:r>
+      </w:hyperlink>
+      <w:r>
+        <w:t xml:space="preserve">, </w:t>
+      </w:r>
+      <w:hyperlink r:id="rId15" w:anchor="figForPaper" w:history="1">
+        <w:r>
+          <w:rPr>
+            <w:rStyle w:val="Hyperlink"/>
+          </w:rPr>
+          <w:t>link to fig XXX (paper only)</w:t>
+        </w:r>
+      </w:hyperlink>
+      <w:r>
+        <w:t xml:space="preserve">, </w:t>
+      </w:r>
+      <w:hyperlink r:id="rId16" w:anchor="figForDigitalAndPaper" w:history="1">
+        <w:r>
+          <w:rPr>
+            <w:rStyle w:val="Hyperlink"/>
+          </w:rPr>
+          <w:t>link to fig XXX (digital and paper)</w:t>
+        </w:r>
+      </w:hyperlink>
+      <w:r>
+        <w:t>.</w:t>
+      </w:r>
     </w:p>
     <w:p>
       <w:pPr>
@@ -1188,7 +1224,7 @@
       <w:r>
         <w:t xml:space="preserve">, </w:t>
       </w:r>
-      <w:hyperlink r:id="rId14" w:anchor="deletedTarget" w:history="1">
+      <w:hyperlink r:id="rId17" w:anchor="deletedTarget" w:history="1">
         <w:r>
           <w:rPr>
             <w:rStyle w:val="Hyperlink"/>
@@ -1199,7 +1235,7 @@
       <w:r>
         <w:t xml:space="preserve">, </w:t>
       </w:r>
-      <w:hyperlink r:id="rId15" w:anchor="h2Subheading" w:history="1">
+      <w:hyperlink r:id="rId18" w:anchor="h2Subheading" w:history="1">
         <w:r>
           <w:rPr>
             <w:rStyle w:val="Hyperlink"/>
@@ -1216,7 +1252,7 @@
         <w:pStyle w:val="BodyText"/>
         <w:jc w:val="both"/>
       </w:pPr>
-      <w:hyperlink r:id="rId16" w:anchor="h1HyperlinksB" w:history="1">
+      <w:hyperlink r:id="rId19" w:anchor="h1HyperlinksB" w:history="1">
         <w:r>
           <w:rPr>
             <w:rStyle w:val="Hyperlink"/>
@@ -1239,7 +1275,7 @@
         <w:pStyle w:val="BodyText"/>
         <w:jc w:val="both"/>
       </w:pPr>
-      <w:hyperlink r:id="rId17" w:history="1">
+      <w:hyperlink r:id="rId20" w:history="1">
         <w:r>
           <w:rPr>
             <w:rStyle w:val="Hyperlink"/>
@@ -1268,7 +1304,7 @@
         <w:pStyle w:val="BodyText"/>
         <w:jc w:val="both"/>
       </w:pPr>
-      <w:hyperlink r:id="rId18" w:history="1">
+      <w:hyperlink r:id="rId21" w:history="1">
         <w:r>
           <w:rPr>
             <w:rStyle w:val="Hyperlink"/>

</xml_diff>

<commit_message>
Replace 'XXX' with '[auto]' as a ref placeholder [skip-ci]
</commit_message>
<xml_diff>
--- a/tests/_fixtures/a_book/01_a.docx
+++ b/tests/_fixtures/a_book/01_a.docx
@@ -1056,7 +1056,7 @@
           <w:rPr>
             <w:rStyle w:val="Hyperlink"/>
           </w:rPr>
-          <w:t>Figure XXX</w:t>
+          <w:t>Figure [auto]</w:t>
         </w:r>
       </w:hyperlink>
       <w:r>
@@ -1073,7 +1073,7 @@
           <w:rPr>
             <w:rStyle w:val="Hyperlink"/>
           </w:rPr>
-          <w:t>Table XXX</w:t>
+          <w:t>Table [auto]</w:t>
         </w:r>
       </w:hyperlink>
       <w:r>
@@ -1150,7 +1150,7 @@
           <w:rPr>
             <w:rStyle w:val="Hyperlink"/>
           </w:rPr>
-          <w:t>see equation XXX</w:t>
+          <w:t>see equation [auto]</w:t>
         </w:r>
       </w:hyperlink>
       <w:r>
@@ -1170,7 +1170,7 @@
           <w:rPr>
             <w:rStyle w:val="Hyperlink"/>
           </w:rPr>
-          <w:t>link to fig XXX (digital only)</w:t>
+          <w:t>link to fig [auto] (digital only)</w:t>
         </w:r>
       </w:hyperlink>
       <w:r>
@@ -1181,7 +1181,7 @@
           <w:rPr>
             <w:rStyle w:val="Hyperlink"/>
           </w:rPr>
-          <w:t>link to fig XXX (paper only)</w:t>
+          <w:t>link to fig [auto] (paper only)</w:t>
         </w:r>
       </w:hyperlink>
       <w:r>
@@ -1192,7 +1192,7 @@
           <w:rPr>
             <w:rStyle w:val="Hyperlink"/>
           </w:rPr>
-          <w:t>link to fig XXX (digital and paper)</w:t>
+          <w:t>link to fig [auto] (digital and paper)</w:t>
         </w:r>
       </w:hyperlink>
       <w:r>

</xml_diff>